<commit_message>
fill data + update readme
</commit_message>
<xml_diff>
--- a/Doc Idea.docx
+++ b/Doc Idea.docx
@@ -2387,12 +2387,7 @@
           <w:szCs w:val="24"/>
           <w:rtl w:val="0"/>
         </w:rPr>
-        <w:t xml:space="preserve">Qwen2.5-0.5B (mô hình trọng tâm) và Llama-3.2-1B (mô hình đối chứng).</w:t>
-      </w:r>
-      <w:r>
-        <w:rPr>
-          <w:rtl w:val="0"/>
-        </w:rPr>
+        <w:t xml:space="preserve">Qwen2.5-1.5B (mô hình trọng tâm) hoặc 3B</w:t>
       </w:r>
     </w:p>
     <w:p>
@@ -2471,6 +2466,637 @@
         </w:rPr>
         <w:t xml:space="preserve">Tận dụng năng lực biểu diễn ngôn ngữ sâu sẵn có từ mô hình ngôn ngữ lớn cỡ nhỏ (SLM), hỗ trợ sinh văn bản mượt mà mà không cần thiết kế khối Encoder riêng biệt.</w:t>
       </w:r>
+    </w:p>
+    <w:p>
+      <w:pPr>
+        <w:numPr>
+          <w:ilvl w:val="0"/>
+          <w:numId w:val="1"/>
+        </w:numPr>
+        <w:spacing w:after="60" w:line="288" w:lineRule="auto"/>
+        <w:ind w:left="360"/>
+        <w:jc w:val="both"/>
+        <w:rPr>
+          <w:rFonts w:ascii="Times New Roman" w:cs="Times New Roman" w:eastAsia="Times New Roman" w:hAnsi="Times New Roman"/>
+          <w:color w:val="222222"/>
+          <w:sz w:val="24"/>
+          <w:szCs w:val="24"/>
+          <w:u w:val="none"/>
+        </w:rPr>
+      </w:pPr>
+      <w:r>
+        <w:rPr>
+          <w:rFonts w:ascii="Times New Roman" w:cs="Times New Roman" w:eastAsia="Times New Roman" w:hAnsi="Times New Roman"/>
+          <w:b w:val="1"/>
+          <w:bCs w:val="1"/>
+          <w:color w:val="222222"/>
+          <w:sz w:val="24"/>
+          <w:szCs w:val="24"/>
+          <w:rtl w:val="0"/>
+        </w:rPr>
+        <w:t xml:space="preserve">Tại sao lại là Multi-task</w:t>
+      </w:r>
+      <w:r>
+        <w:rPr>
+          <w:rFonts w:ascii="Times New Roman" w:cs="Times New Roman" w:eastAsia="Times New Roman" w:hAnsi="Times New Roman"/>
+          <w:color w:val="222222"/>
+          <w:sz w:val="24"/>
+          <w:szCs w:val="24"/>
+          <w:rtl w:val="0"/>
+        </w:rPr>
+        <w:t xml:space="preserve"> : Các công trình nghiên cứu trước đó chỉ ra rằng : MTL (Muti-Task Learning cho ra kết quả tốt hơn so với 1 task). Sau đây là giải thích về những vượt trội của MTL:  </w:t>
+      </w:r>
+    </w:p>
+    <w:p>
+      <w:pPr>
+        <w:pStyle w:val="Heading2"/>
+        <w:keepNext w:val="0"/>
+        <w:keepLines w:val="0"/>
+        <w:spacing w:after="80" w:line="288" w:lineRule="auto"/>
+        <w:ind w:left="360"/>
+        <w:jc w:val="both"/>
+        <w:rPr>
+          <w:rFonts w:ascii="Times New Roman" w:cs="Times New Roman" w:eastAsia="Times New Roman" w:hAnsi="Times New Roman"/>
+          <w:b w:val="1"/>
+          <w:bCs w:val="1"/>
+          <w:color w:val="222222"/>
+          <w:sz w:val="26"/>
+          <w:szCs w:val="26"/>
+        </w:rPr>
+      </w:pPr>
+      <w:bookmarkStart w:colFirst="0" w:colLast="0" w:name="_2rbsolsddj5w" w:id="0"/>
+      <w:bookmarkEnd w:id="0"/>
+      <w:r>
+        <w:rPr>
+          <w:rFonts w:ascii="Times New Roman" w:cs="Times New Roman" w:eastAsia="Times New Roman" w:hAnsi="Times New Roman"/>
+          <w:b w:val="1"/>
+          <w:bCs w:val="1"/>
+          <w:color w:val="222222"/>
+          <w:sz w:val="26"/>
+          <w:szCs w:val="26"/>
+          <w:rtl w:val="0"/>
+        </w:rPr>
+        <w:t xml:space="preserve">1. Học biểu diễn chung tốt hơn</w:t>
+      </w:r>
+    </w:p>
+    <w:p>
+      <w:pPr>
+        <w:spacing w:after="240" w:before="240" w:line="288" w:lineRule="auto"/>
+        <w:jc w:val="both"/>
+        <w:rPr>
+          <w:rFonts w:ascii="Times New Roman" w:cs="Times New Roman" w:eastAsia="Times New Roman" w:hAnsi="Times New Roman"/>
+          <w:color w:val="222222"/>
+          <w:sz w:val="26"/>
+          <w:szCs w:val="26"/>
+        </w:rPr>
+      </w:pPr>
+      <w:r>
+        <w:rPr>
+          <w:rFonts w:ascii="Times New Roman" w:cs="Times New Roman" w:eastAsia="Times New Roman" w:hAnsi="Times New Roman"/>
+          <w:color w:val="222222"/>
+          <w:sz w:val="26"/>
+          <w:szCs w:val="26"/>
+          <w:rtl w:val="0"/>
+        </w:rPr>
+        <w:t xml:space="preserve">Backbone chia sẻ buộc model học </w:t>
+      </w:r>
+      <w:r>
+        <w:rPr>
+          <w:rFonts w:ascii="Times New Roman" w:cs="Times New Roman" w:eastAsia="Times New Roman" w:hAnsi="Times New Roman"/>
+          <w:b w:val="1"/>
+          <w:bCs w:val="1"/>
+          <w:color w:val="222222"/>
+          <w:sz w:val="26"/>
+          <w:szCs w:val="26"/>
+          <w:rtl w:val="0"/>
+        </w:rPr>
+        <w:t xml:space="preserve">đặc trưng hữu ích cho cả 2 task</w:t>
+      </w:r>
+      <w:r>
+        <w:rPr>
+          <w:rFonts w:ascii="Times New Roman" w:cs="Times New Roman" w:eastAsia="Times New Roman" w:hAnsi="Times New Roman"/>
+          <w:color w:val="222222"/>
+          <w:sz w:val="26"/>
+          <w:szCs w:val="26"/>
+          <w:rtl w:val="0"/>
+        </w:rPr>
+        <w:t xml:space="preserve">. Task dự đoán và task giải trình bổ trợ nhau → backbone học sâu hơn.</w:t>
+      </w:r>
+    </w:p>
+    <w:p>
+      <w:pPr>
+        <w:pStyle w:val="Heading2"/>
+        <w:keepNext w:val="0"/>
+        <w:keepLines w:val="0"/>
+        <w:spacing w:after="80" w:line="288" w:lineRule="auto"/>
+        <w:ind w:left="360"/>
+        <w:jc w:val="both"/>
+        <w:rPr>
+          <w:rFonts w:ascii="Times New Roman" w:cs="Times New Roman" w:eastAsia="Times New Roman" w:hAnsi="Times New Roman"/>
+          <w:b w:val="1"/>
+          <w:bCs w:val="1"/>
+          <w:color w:val="222222"/>
+          <w:sz w:val="26"/>
+          <w:szCs w:val="26"/>
+        </w:rPr>
+      </w:pPr>
+      <w:bookmarkStart w:colFirst="0" w:colLast="0" w:name="_i94fk63ddp03" w:id="1"/>
+      <w:bookmarkEnd w:id="1"/>
+      <w:r>
+        <w:rPr>
+          <w:rFonts w:ascii="Times New Roman" w:cs="Times New Roman" w:eastAsia="Times New Roman" w:hAnsi="Times New Roman"/>
+          <w:b w:val="1"/>
+          <w:bCs w:val="1"/>
+          <w:color w:val="222222"/>
+          <w:sz w:val="26"/>
+          <w:szCs w:val="26"/>
+          <w:rtl w:val="0"/>
+        </w:rPr>
+        <w:t xml:space="preserve">2. Giảm overfitting</w:t>
+      </w:r>
+    </w:p>
+    <w:p>
+      <w:pPr>
+        <w:spacing w:after="240" w:before="240" w:line="288" w:lineRule="auto"/>
+        <w:jc w:val="both"/>
+        <w:rPr>
+          <w:rFonts w:ascii="Times New Roman" w:cs="Times New Roman" w:eastAsia="Times New Roman" w:hAnsi="Times New Roman"/>
+          <w:color w:val="222222"/>
+          <w:sz w:val="26"/>
+          <w:szCs w:val="26"/>
+        </w:rPr>
+      </w:pPr>
+      <w:r>
+        <w:rPr>
+          <w:rFonts w:ascii="Times New Roman" w:cs="Times New Roman" w:eastAsia="Times New Roman" w:hAnsi="Times New Roman"/>
+          <w:color w:val="222222"/>
+          <w:sz w:val="26"/>
+          <w:szCs w:val="26"/>
+          <w:rtl w:val="0"/>
+        </w:rPr>
+        <w:t xml:space="preserve">Hai task tạo </w:t>
+      </w:r>
+      <w:r>
+        <w:rPr>
+          <w:rFonts w:ascii="Times New Roman" w:cs="Times New Roman" w:eastAsia="Times New Roman" w:hAnsi="Times New Roman"/>
+          <w:b w:val="1"/>
+          <w:bCs w:val="1"/>
+          <w:color w:val="222222"/>
+          <w:sz w:val="26"/>
+          <w:szCs w:val="26"/>
+          <w:rtl w:val="0"/>
+        </w:rPr>
+        <w:t xml:space="preserve">2 tín hiệu giám sát</w:t>
+      </w:r>
+      <w:r>
+        <w:rPr>
+          <w:rFonts w:ascii="Times New Roman" w:cs="Times New Roman" w:eastAsia="Times New Roman" w:hAnsi="Times New Roman"/>
+          <w:color w:val="222222"/>
+          <w:sz w:val="26"/>
+          <w:szCs w:val="26"/>
+          <w:rtl w:val="0"/>
+        </w:rPr>
+        <w:t xml:space="preserve"> trên cùng backbone → model khó "học vẹt" 1 task. Đây là </w:t>
+      </w:r>
+      <w:r>
+        <w:rPr>
+          <w:rFonts w:ascii="Times New Roman" w:cs="Times New Roman" w:eastAsia="Times New Roman" w:hAnsi="Times New Roman"/>
+          <w:b w:val="1"/>
+          <w:bCs w:val="1"/>
+          <w:color w:val="222222"/>
+          <w:sz w:val="26"/>
+          <w:szCs w:val="26"/>
+          <w:rtl w:val="0"/>
+        </w:rPr>
+        <w:t xml:space="preserve">inductive bias</w:t>
+      </w:r>
+      <w:r>
+        <w:rPr>
+          <w:rFonts w:ascii="Times New Roman" w:cs="Times New Roman" w:eastAsia="Times New Roman" w:hAnsi="Times New Roman"/>
+          <w:color w:val="222222"/>
+          <w:sz w:val="26"/>
+          <w:szCs w:val="26"/>
+          <w:rtl w:val="0"/>
+        </w:rPr>
+        <w:t xml:space="preserve"> hiệu quả (Caruana 1997).</w:t>
+      </w:r>
+    </w:p>
+    <w:p>
+      <w:pPr>
+        <w:pStyle w:val="Heading2"/>
+        <w:keepNext w:val="0"/>
+        <w:keepLines w:val="0"/>
+        <w:spacing w:after="80" w:line="288" w:lineRule="auto"/>
+        <w:ind w:left="360"/>
+        <w:jc w:val="both"/>
+        <w:rPr>
+          <w:rFonts w:ascii="Times New Roman" w:cs="Times New Roman" w:eastAsia="Times New Roman" w:hAnsi="Times New Roman"/>
+          <w:b w:val="1"/>
+          <w:bCs w:val="1"/>
+          <w:color w:val="222222"/>
+          <w:sz w:val="26"/>
+          <w:szCs w:val="26"/>
+        </w:rPr>
+      </w:pPr>
+      <w:bookmarkStart w:colFirst="0" w:colLast="0" w:name="_67c9ww7v9zaw" w:id="2"/>
+      <w:bookmarkEnd w:id="2"/>
+      <w:r>
+        <w:rPr>
+          <w:rFonts w:ascii="Times New Roman" w:cs="Times New Roman" w:eastAsia="Times New Roman" w:hAnsi="Times New Roman"/>
+          <w:b w:val="1"/>
+          <w:bCs w:val="1"/>
+          <w:color w:val="222222"/>
+          <w:sz w:val="26"/>
+          <w:szCs w:val="26"/>
+          <w:rtl w:val="0"/>
+        </w:rPr>
+        <w:t xml:space="preserve">3. Học được tương quan ẩn</w:t>
+      </w:r>
+    </w:p>
+    <w:p>
+      <w:pPr>
+        <w:spacing w:after="240" w:before="240" w:line="288" w:lineRule="auto"/>
+        <w:jc w:val="both"/>
+        <w:rPr>
+          <w:rFonts w:ascii="Times New Roman" w:cs="Times New Roman" w:eastAsia="Times New Roman" w:hAnsi="Times New Roman"/>
+          <w:color w:val="222222"/>
+          <w:sz w:val="26"/>
+          <w:szCs w:val="26"/>
+        </w:rPr>
+      </w:pPr>
+      <w:r>
+        <w:rPr>
+          <w:rFonts w:ascii="Times New Roman" w:cs="Times New Roman" w:eastAsia="Times New Roman" w:hAnsi="Times New Roman"/>
+          <w:color w:val="222222"/>
+          <w:sz w:val="26"/>
+          <w:szCs w:val="26"/>
+          <w:rtl w:val="0"/>
+        </w:rPr>
+        <w:t xml:space="preserve">Ví dụ:</w:t>
+      </w:r>
+    </w:p>
+    <w:p>
+      <w:pPr>
+        <w:numPr>
+          <w:ilvl w:val="0"/>
+          <w:numId w:val="3"/>
+        </w:numPr>
+        <w:spacing w:after="0" w:afterAutospacing="0" w:before="240" w:line="288" w:lineRule="auto"/>
+        <w:ind w:left="720" w:hanging="360"/>
+        <w:rPr>
+          <w:rFonts w:ascii="Times New Roman" w:cs="Times New Roman" w:eastAsia="Times New Roman" w:hAnsi="Times New Roman"/>
+          <w:color w:val="222222"/>
+          <w:sz w:val="26"/>
+          <w:szCs w:val="26"/>
+        </w:rPr>
+      </w:pPr>
+      <w:r>
+        <w:rPr>
+          <w:rFonts w:ascii="Times New Roman" w:cs="Times New Roman" w:eastAsia="Times New Roman" w:hAnsi="Times New Roman"/>
+          <w:color w:val="222222"/>
+          <w:sz w:val="26"/>
+          <w:szCs w:val="26"/>
+          <w:rtl w:val="0"/>
+        </w:rPr>
+        <w:t xml:space="preserve">Task giải trình buộc model hiểu </w:t>
+      </w:r>
+      <w:r>
+        <w:rPr>
+          <w:rFonts w:ascii="Times New Roman" w:cs="Times New Roman" w:eastAsia="Times New Roman" w:hAnsi="Times New Roman"/>
+          <w:b w:val="1"/>
+          <w:bCs w:val="1"/>
+          <w:color w:val="222222"/>
+          <w:sz w:val="26"/>
+          <w:szCs w:val="26"/>
+          <w:rtl w:val="0"/>
+        </w:rPr>
+        <w:t xml:space="preserve">tại sao</w:t>
+      </w:r>
+      <w:r>
+        <w:rPr>
+          <w:rFonts w:ascii="Times New Roman" w:cs="Times New Roman" w:eastAsia="Times New Roman" w:hAnsi="Times New Roman"/>
+          <w:color w:val="222222"/>
+          <w:sz w:val="26"/>
+          <w:szCs w:val="26"/>
+          <w:rtl w:val="0"/>
+        </w:rPr>
+        <w:t xml:space="preserve"> giá tăng/giảm.</w:t>
+      </w:r>
+    </w:p>
+    <w:p>
+      <w:pPr>
+        <w:numPr>
+          <w:ilvl w:val="0"/>
+          <w:numId w:val="3"/>
+        </w:numPr>
+        <w:spacing w:after="0" w:afterAutospacing="0" w:before="0" w:beforeAutospacing="0" w:line="288" w:lineRule="auto"/>
+        <w:ind w:left="720" w:hanging="360"/>
+        <w:rPr>
+          <w:rFonts w:ascii="Times New Roman" w:cs="Times New Roman" w:eastAsia="Times New Roman" w:hAnsi="Times New Roman"/>
+          <w:color w:val="222222"/>
+          <w:sz w:val="26"/>
+          <w:szCs w:val="26"/>
+        </w:rPr>
+      </w:pPr>
+      <w:r>
+        <w:rPr>
+          <w:rFonts w:ascii="Times New Roman" w:cs="Times New Roman" w:eastAsia="Times New Roman" w:hAnsi="Times New Roman"/>
+          <w:color w:val="222222"/>
+          <w:sz w:val="26"/>
+          <w:szCs w:val="26"/>
+          <w:rtl w:val="0"/>
+        </w:rPr>
+        <w:t xml:space="preserve">Hiểu "tại sao" → dự đoán chính xác hơn.</w:t>
+      </w:r>
+    </w:p>
+    <w:p>
+      <w:pPr>
+        <w:numPr>
+          <w:ilvl w:val="0"/>
+          <w:numId w:val="3"/>
+        </w:numPr>
+        <w:spacing w:after="240" w:before="0" w:beforeAutospacing="0" w:line="288" w:lineRule="auto"/>
+        <w:ind w:left="720" w:hanging="360"/>
+        <w:rPr>
+          <w:rFonts w:ascii="Times New Roman" w:cs="Times New Roman" w:eastAsia="Times New Roman" w:hAnsi="Times New Roman"/>
+          <w:color w:val="222222"/>
+          <w:sz w:val="26"/>
+          <w:szCs w:val="26"/>
+        </w:rPr>
+      </w:pPr>
+      <w:r>
+        <w:rPr>
+          <w:rFonts w:ascii="Times New Roman" w:cs="Times New Roman" w:eastAsia="Times New Roman" w:hAnsi="Times New Roman"/>
+          <w:color w:val="222222"/>
+          <w:sz w:val="26"/>
+          <w:szCs w:val="26"/>
+          <w:rtl w:val="0"/>
+        </w:rPr>
+        <w:t xml:space="preserve">Ngược lại, dự đoán đúng → giải trình có căn cứ hơn.</w:t>
+      </w:r>
+    </w:p>
+    <w:p>
+      <w:pPr>
+        <w:pStyle w:val="Heading2"/>
+        <w:keepNext w:val="0"/>
+        <w:keepLines w:val="0"/>
+        <w:spacing w:after="80" w:line="288" w:lineRule="auto"/>
+        <w:ind w:left="360"/>
+        <w:jc w:val="both"/>
+        <w:rPr>
+          <w:rFonts w:ascii="Times New Roman" w:cs="Times New Roman" w:eastAsia="Times New Roman" w:hAnsi="Times New Roman"/>
+          <w:b w:val="1"/>
+          <w:bCs w:val="1"/>
+          <w:color w:val="222222"/>
+          <w:sz w:val="26"/>
+          <w:szCs w:val="26"/>
+        </w:rPr>
+      </w:pPr>
+      <w:bookmarkStart w:colFirst="0" w:colLast="0" w:name="_wyn8cdgazbl" w:id="3"/>
+      <w:bookmarkEnd w:id="3"/>
+      <w:r>
+        <w:rPr>
+          <w:rFonts w:ascii="Times New Roman" w:cs="Times New Roman" w:eastAsia="Times New Roman" w:hAnsi="Times New Roman"/>
+          <w:b w:val="1"/>
+          <w:bCs w:val="1"/>
+          <w:color w:val="222222"/>
+          <w:sz w:val="26"/>
+          <w:szCs w:val="26"/>
+          <w:rtl w:val="0"/>
+        </w:rPr>
+        <w:t xml:space="preserve">4. Tiết kiệm tham số</w:t>
+      </w:r>
+    </w:p>
+    <w:p>
+      <w:pPr>
+        <w:spacing w:after="240" w:before="240" w:line="288" w:lineRule="auto"/>
+        <w:jc w:val="both"/>
+        <w:rPr>
+          <w:rFonts w:ascii="Times New Roman" w:cs="Times New Roman" w:eastAsia="Times New Roman" w:hAnsi="Times New Roman"/>
+          <w:color w:val="222222"/>
+          <w:sz w:val="26"/>
+          <w:szCs w:val="26"/>
+        </w:rPr>
+      </w:pPr>
+      <w:r>
+        <w:rPr>
+          <w:rFonts w:ascii="Times New Roman" w:cs="Times New Roman" w:eastAsia="Times New Roman" w:hAnsi="Times New Roman"/>
+          <w:color w:val="222222"/>
+          <w:sz w:val="26"/>
+          <w:szCs w:val="26"/>
+          <w:rtl w:val="0"/>
+        </w:rPr>
+        <w:t xml:space="preserve">1 backbone + 2 head nhẹ </w:t>
+      </w:r>
+      <w:r>
+        <w:rPr>
+          <w:rFonts w:ascii="Times New Roman" w:cs="Times New Roman" w:eastAsia="Times New Roman" w:hAnsi="Times New Roman"/>
+          <w:b w:val="1"/>
+          <w:bCs w:val="1"/>
+          <w:color w:val="222222"/>
+          <w:sz w:val="26"/>
+          <w:szCs w:val="26"/>
+          <w:rtl w:val="0"/>
+        </w:rPr>
+        <w:t xml:space="preserve">&lt; 2 model riêng biệt</w:t>
+      </w:r>
+      <w:r>
+        <w:rPr>
+          <w:rFonts w:ascii="Times New Roman" w:cs="Times New Roman" w:eastAsia="Times New Roman" w:hAnsi="Times New Roman"/>
+          <w:color w:val="222222"/>
+          <w:sz w:val="26"/>
+          <w:szCs w:val="26"/>
+          <w:rtl w:val="0"/>
+        </w:rPr>
+        <w:t xml:space="preserve">. Quan trọng khi chạy on-premise.</w:t>
+      </w:r>
+    </w:p>
+    <w:p>
+      <w:pPr>
+        <w:pStyle w:val="Heading2"/>
+        <w:keepNext w:val="0"/>
+        <w:keepLines w:val="0"/>
+        <w:spacing w:after="80" w:line="288" w:lineRule="auto"/>
+        <w:ind w:left="360"/>
+        <w:jc w:val="both"/>
+        <w:rPr>
+          <w:rFonts w:ascii="Times New Roman" w:cs="Times New Roman" w:eastAsia="Times New Roman" w:hAnsi="Times New Roman"/>
+          <w:b w:val="1"/>
+          <w:bCs w:val="1"/>
+          <w:color w:val="222222"/>
+          <w:sz w:val="26"/>
+          <w:szCs w:val="26"/>
+        </w:rPr>
+      </w:pPr>
+      <w:bookmarkStart w:colFirst="0" w:colLast="0" w:name="_tuja8a2idkup" w:id="4"/>
+      <w:bookmarkEnd w:id="4"/>
+      <w:r>
+        <w:rPr>
+          <w:rFonts w:ascii="Times New Roman" w:cs="Times New Roman" w:eastAsia="Times New Roman" w:hAnsi="Times New Roman"/>
+          <w:b w:val="1"/>
+          <w:bCs w:val="1"/>
+          <w:color w:val="222222"/>
+          <w:sz w:val="26"/>
+          <w:szCs w:val="26"/>
+          <w:rtl w:val="0"/>
+        </w:rPr>
+        <w:t xml:space="preserve">5. Hội tụ nhanh hơn</w:t>
+      </w:r>
+    </w:p>
+    <w:p>
+      <w:pPr>
+        <w:spacing w:after="240" w:before="240" w:line="288" w:lineRule="auto"/>
+        <w:jc w:val="both"/>
+        <w:rPr>
+          <w:rFonts w:ascii="Times New Roman" w:cs="Times New Roman" w:eastAsia="Times New Roman" w:hAnsi="Times New Roman"/>
+          <w:color w:val="222222"/>
+          <w:sz w:val="26"/>
+          <w:szCs w:val="26"/>
+        </w:rPr>
+      </w:pPr>
+      <w:r>
+        <w:rPr>
+          <w:rFonts w:ascii="Times New Roman" w:cs="Times New Roman" w:eastAsia="Times New Roman" w:hAnsi="Times New Roman"/>
+          <w:color w:val="222222"/>
+          <w:sz w:val="26"/>
+          <w:szCs w:val="26"/>
+          <w:rtl w:val="0"/>
+        </w:rPr>
+        <w:t xml:space="preserve">Task dễ (prediction) hỗ trợ task khó (explanation) học nhanh hơn.</w:t>
+      </w:r>
+    </w:p>
+    <w:p>
+      <w:pPr>
+        <w:pStyle w:val="Heading2"/>
+        <w:keepNext w:val="0"/>
+        <w:keepLines w:val="0"/>
+        <w:spacing w:after="80" w:line="288" w:lineRule="auto"/>
+        <w:ind w:left="360"/>
+        <w:jc w:val="both"/>
+        <w:rPr>
+          <w:rFonts w:ascii="Times New Roman" w:cs="Times New Roman" w:eastAsia="Times New Roman" w:hAnsi="Times New Roman"/>
+          <w:b w:val="1"/>
+          <w:bCs w:val="1"/>
+          <w:color w:val="222222"/>
+          <w:sz w:val="26"/>
+          <w:szCs w:val="26"/>
+        </w:rPr>
+      </w:pPr>
+      <w:bookmarkStart w:colFirst="0" w:colLast="0" w:name="_6jqwvxt10yap" w:id="5"/>
+      <w:bookmarkEnd w:id="5"/>
+      <w:r>
+        <w:rPr>
+          <w:rFonts w:ascii="Times New Roman" w:cs="Times New Roman" w:eastAsia="Times New Roman" w:hAnsi="Times New Roman"/>
+          <w:b w:val="1"/>
+          <w:bCs w:val="1"/>
+          <w:color w:val="222222"/>
+          <w:sz w:val="26"/>
+          <w:szCs w:val="26"/>
+          <w:rtl w:val="0"/>
+        </w:rPr>
+        <w:t xml:space="preserve">6. Giải thích được (Explainable AI)</w:t>
+      </w:r>
+    </w:p>
+    <w:p>
+      <w:pPr>
+        <w:spacing w:after="240" w:before="240" w:line="288" w:lineRule="auto"/>
+        <w:jc w:val="both"/>
+        <w:rPr>
+          <w:rFonts w:ascii="Times New Roman" w:cs="Times New Roman" w:eastAsia="Times New Roman" w:hAnsi="Times New Roman"/>
+          <w:color w:val="222222"/>
+          <w:sz w:val="26"/>
+          <w:szCs w:val="26"/>
+        </w:rPr>
+      </w:pPr>
+      <w:r>
+        <w:rPr>
+          <w:rFonts w:ascii="Times New Roman" w:cs="Times New Roman" w:eastAsia="Times New Roman" w:hAnsi="Times New Roman"/>
+          <w:color w:val="222222"/>
+          <w:sz w:val="26"/>
+          <w:szCs w:val="26"/>
+          <w:rtl w:val="0"/>
+        </w:rPr>
+        <w:t xml:space="preserve">Task giải trình </w:t>
+      </w:r>
+      <w:r>
+        <w:rPr>
+          <w:rFonts w:ascii="Times New Roman" w:cs="Times New Roman" w:eastAsia="Times New Roman" w:hAnsi="Times New Roman"/>
+          <w:b w:val="1"/>
+          <w:bCs w:val="1"/>
+          <w:color w:val="222222"/>
+          <w:sz w:val="26"/>
+          <w:szCs w:val="26"/>
+          <w:rtl w:val="0"/>
+        </w:rPr>
+        <w:t xml:space="preserve">tự nhiên</w:t>
+      </w:r>
+      <w:r>
+        <w:rPr>
+          <w:rFonts w:ascii="Cardo" w:cs="Cardo" w:eastAsia="Cardo" w:hAnsi="Cardo"/>
+          <w:color w:val="222222"/>
+          <w:sz w:val="26"/>
+          <w:szCs w:val="26"/>
+          <w:rtl w:val="0"/>
+        </w:rPr>
+        <w:t xml:space="preserve"> sinh ra lý do → không cần thêm module XAI (SHAP, LIME).</w:t>
+      </w:r>
+    </w:p>
+    <w:p>
+      <w:pPr>
+        <w:spacing w:after="60" w:line="288" w:lineRule="auto"/>
+        <w:ind w:left="360" w:firstLine="0"/>
+        <w:jc w:val="both"/>
+        <w:rPr>
+          <w:rFonts w:ascii="Times New Roman" w:cs="Times New Roman" w:eastAsia="Times New Roman" w:hAnsi="Times New Roman"/>
+          <w:color w:val="222222"/>
+          <w:sz w:val="24"/>
+          <w:szCs w:val="24"/>
+        </w:rPr>
+      </w:pPr>
+      <w:r>
+        <w:rPr>
+          <w:rtl w:val="0"/>
+        </w:rPr>
+      </w:r>
+    </w:p>
+    <w:p>
+      <w:pPr>
+        <w:numPr>
+          <w:ilvl w:val="1"/>
+          <w:numId w:val="1"/>
+        </w:numPr>
+        <w:spacing w:after="60" w:line="288" w:lineRule="auto"/>
+        <w:jc w:val="both"/>
+        <w:rPr>
+          <w:rFonts w:ascii="Times New Roman" w:cs="Times New Roman" w:eastAsia="Times New Roman" w:hAnsi="Times New Roman"/>
+          <w:color w:val="222222"/>
+          <w:sz w:val="24"/>
+          <w:szCs w:val="24"/>
+          <w:u w:val="none"/>
+        </w:rPr>
+      </w:pPr>
+      <w:r>
+        <w:rPr>
+          <w:rtl w:val="0"/>
+        </w:rPr>
+      </w:r>
+    </w:p>
+    <w:p>
+      <w:pPr>
+        <w:numPr>
+          <w:ilvl w:val="2"/>
+          <w:numId w:val="1"/>
+        </w:numPr>
+        <w:spacing w:after="60" w:line="288" w:lineRule="auto"/>
+        <w:jc w:val="both"/>
+        <w:rPr>
+          <w:rFonts w:ascii="Times New Roman" w:cs="Times New Roman" w:eastAsia="Times New Roman" w:hAnsi="Times New Roman"/>
+          <w:color w:val="222222"/>
+          <w:sz w:val="24"/>
+          <w:szCs w:val="24"/>
+          <w:u w:val="none"/>
+        </w:rPr>
+      </w:pPr>
       <w:r>
         <w:rPr>
           <w:rtl w:val="0"/>
@@ -3031,14 +3657,448 @@
         </w:rPr>
       </w:pPr>
       <w:r>
+        <w:t>Nếu nhánh Prediction dự đoán xu hướng 'Tăng (Up)' nhưng nhánh Explanation lại sinh các cụm từ thể hiện rủi ro cao hoặc suy thoái doanh thu, hàm mất mát Consistency Loss sẽ tính toán mức độ mâu thuẫn và phạt nặng gradient lên shared backbone. Đây là đóng góp phương pháp trọng tâm của đề tài.</w:t>
+      </w:r>
+    </w:p>
+    <w:p>
+      <w:pPr>
+        <w:spacing w:after="100" w:line="288" w:lineRule="auto"/>
+        <w:jc w:val="both"/>
         <w:rPr>
           <w:rFonts w:ascii="Times New Roman" w:cs="Times New Roman" w:eastAsia="Times New Roman" w:hAnsi="Times New Roman"/>
           <w:color w:val="222222"/>
           <w:sz w:val="24"/>
           <w:szCs w:val="24"/>
-          <w:rtl w:val="0"/>
-        </w:rPr>
-        <w:t xml:space="preserve">Nếu nhánh Prediction dự đoán xu hướng 'Tăng (Up)' nhưng nhánh Explanation lại sinh các cụm từ thể hiện rủi ro cao hoặc suy thoái doanh thu, hàm mất mát Consistency Loss sẽ tính toán mức độ mâu thuẫn thông qua mô hình NLI nhỏ (DeBERTa-MNLI) và phạt nặng gradient. Đây là đóng góp phương pháp trọng tâm của đề tài.</w:t>
+        </w:rPr>
+      </w:pPr>
+      <w:r>
+        <w:t>Đề tài chính thức ứng dụng kiến trúc OpenJev (Verdict 2.0 / ModernBERT-151M Calibrated Decision Engine) để thay thế hoàn toàn cho mô hình NLI truyền thống (DeBERTa-MNLI). OpenJev đảm nhiệm vai trò là một mô hình NLI hiệu chuẩn thế hệ mới, mang lại 4 ưu thế vượt trội:</w:t>
+      </w:r>
+    </w:p>
+    <w:p>
+      <w:pPr>
+        <w:spacing w:after="100" w:line="288" w:lineRule="auto"/>
+        <w:jc w:val="both"/>
+        <w:rPr>
+          <w:rFonts w:ascii="Times New Roman" w:cs="Times New Roman" w:eastAsia="Times New Roman" w:hAnsi="Times New Roman"/>
+          <w:b w:val="1"/>
+          <w:bCs w:val="1"/>
+          <w:color w:val="222222"/>
+          <w:sz w:val="24"/>
+          <w:szCs w:val="24"/>
+        </w:rPr>
+      </w:pPr>
+      <w:r>
+        <w:t>#### ① Cơ chế chống ảo giác và phạt 'chém gió' (Abstention &amp; Evidence Penalty)</w:t>
+      </w:r>
+    </w:p>
+    <w:p>
+      <w:pPr>
+        <w:spacing w:after="100" w:line="288" w:lineRule="auto"/>
+        <w:jc w:val="both"/>
+        <w:rPr>
+          <w:rFonts w:ascii="Times New Roman" w:cs="Times New Roman" w:eastAsia="Times New Roman" w:hAnsi="Times New Roman"/>
+          <w:color w:val="222222"/>
+          <w:sz w:val="24"/>
+          <w:szCs w:val="24"/>
+        </w:rPr>
+      </w:pPr>
+      <w:r>
+        <w:t>• DeBERTa-MNLI truyền thống: Nếu bài văn giải trình của Qwen là văn sáo rỗng, chém gió theo tin đồn, DeBERTa vẫn cố gượng ép chấm điểm phân loại.</w:t>
+      </w:r>
+    </w:p>
+    <w:p>
+      <w:pPr>
+        <w:spacing w:after="100" w:line="288" w:lineRule="auto"/>
+        <w:jc w:val="both"/>
+        <w:rPr>
+          <w:rFonts w:ascii="Times New Roman" w:cs="Times New Roman" w:eastAsia="Times New Roman" w:hAnsi="Times New Roman"/>
+          <w:color w:val="222222"/>
+          <w:sz w:val="24"/>
+          <w:szCs w:val="24"/>
+        </w:rPr>
+      </w:pPr>
+      <w:r>
+        <w:t>• OpenJev: Có nhãn độc quyền __insufficient_evidence__. Nếu bài giải trình của Qwen không có số liệu tài chính xác thực hoặc luận điểm mập mờ, OpenJev kích hoạt nhãn này và phạt cực nặng Qwen vì tội bịa đặt (Hallucination).</w:t>
+      </w:r>
+    </w:p>
+    <w:p>
+      <w:pPr>
+        <w:spacing w:after="100" w:line="288" w:lineRule="auto"/>
+        <w:jc w:val="both"/>
+        <w:rPr>
+          <w:rFonts w:ascii="Times New Roman" w:cs="Times New Roman" w:eastAsia="Times New Roman" w:hAnsi="Times New Roman"/>
+          <w:color w:val="222222"/>
+          <w:sz w:val="24"/>
+          <w:szCs w:val="24"/>
+        </w:rPr>
+      </w:pPr>
+      <w:r/>
+    </w:p>
+    <w:p>
+      <w:pPr>
+        <w:spacing w:after="100" w:line="288" w:lineRule="auto"/>
+        <w:jc w:val="both"/>
+        <w:rPr>
+          <w:rFonts w:ascii="Times New Roman" w:cs="Times New Roman" w:eastAsia="Times New Roman" w:hAnsi="Times New Roman"/>
+          <w:color w:val="222222"/>
+          <w:sz w:val="24"/>
+          <w:szCs w:val="24"/>
+        </w:rPr>
+      </w:pPr>
+      <w:r>
+        <w:rPr>
+          <w:rtl w:val="0"/>
+        </w:rPr>
+      </w:r>
+    </w:p>
+    <w:p>
+      <w:pPr>
+        <w:spacing w:after="100" w:line="288" w:lineRule="auto"/>
+        <w:jc w:val="both"/>
+        <w:rPr>
+          <w:rFonts w:ascii="Times New Roman" w:cs="Times New Roman" w:eastAsia="Times New Roman" w:hAnsi="Times New Roman"/>
+          <w:color w:val="222222"/>
+          <w:sz w:val="24"/>
+          <w:szCs w:val="24"/>
+        </w:rPr>
+      </w:pPr>
+      <w:r>
+        <w:rPr>
+          <w:rFonts w:ascii="Times New Roman" w:cs="Times New Roman" w:eastAsia="Times New Roman" w:hAnsi="Times New Roman"/>
+          <w:color w:val="222222"/>
+          <w:sz w:val="24"/>
+          <w:szCs w:val="24"/>
+          <w:rtl w:val="0"/>
+        </w:rPr>
+        <w:t xml:space="preserve">  #### ② Phán quyết đa chiều tài chính vs 3 nhãn cứng nhắc</w:t>
+      </w:r>
+    </w:p>
+    <w:p>
+      <w:pPr>
+        <w:spacing w:after="100" w:line="288" w:lineRule="auto"/>
+        <w:jc w:val="both"/>
+        <w:rPr>
+          <w:rFonts w:ascii="Times New Roman" w:cs="Times New Roman" w:eastAsia="Times New Roman" w:hAnsi="Times New Roman"/>
+          <w:color w:val="222222"/>
+          <w:sz w:val="24"/>
+          <w:szCs w:val="24"/>
+        </w:rPr>
+      </w:pPr>
+      <w:r>
+        <w:rPr>
+          <w:rtl w:val="0"/>
+        </w:rPr>
+      </w:r>
+    </w:p>
+    <w:p>
+      <w:pPr>
+        <w:spacing w:after="100" w:line="288" w:lineRule="auto"/>
+        <w:jc w:val="both"/>
+        <w:rPr>
+          <w:rFonts w:ascii="Times New Roman" w:cs="Times New Roman" w:eastAsia="Times New Roman" w:hAnsi="Times New Roman"/>
+          <w:color w:val="222222"/>
+          <w:sz w:val="24"/>
+          <w:szCs w:val="24"/>
+        </w:rPr>
+      </w:pPr>
+      <w:r>
+        <w:rPr>
+          <w:rFonts w:ascii="Times New Roman" w:cs="Times New Roman" w:eastAsia="Times New Roman" w:hAnsi="Times New Roman"/>
+          <w:color w:val="222222"/>
+          <w:sz w:val="24"/>
+          <w:szCs w:val="24"/>
+          <w:rtl w:val="0"/>
+        </w:rPr>
+        <w:t xml:space="preserve">  • DeBERTa: Chỉ biết Đúng/Sai một cách thô thiển (Entailment / Contradiction).</w:t>
+      </w:r>
+    </w:p>
+    <w:p>
+      <w:pPr>
+        <w:spacing w:after="100" w:line="288" w:lineRule="auto"/>
+        <w:jc w:val="both"/>
+        <w:rPr>
+          <w:rFonts w:ascii="Times New Roman" w:cs="Times New Roman" w:eastAsia="Times New Roman" w:hAnsi="Times New Roman"/>
+          <w:color w:val="222222"/>
+          <w:sz w:val="24"/>
+          <w:szCs w:val="24"/>
+        </w:rPr>
+      </w:pPr>
+      <w:r>
+        <w:rPr>
+          <w:rFonts w:ascii="Times New Roman" w:cs="Times New Roman" w:eastAsia="Times New Roman" w:hAnsi="Times New Roman"/>
+          <w:color w:val="222222"/>
+          <w:sz w:val="24"/>
+          <w:szCs w:val="24"/>
+          <w:rtl w:val="0"/>
+        </w:rPr>
+        <w:t xml:space="preserve">  • OpenJev: Hiểu được ngữ nghĩa tài chính đa chiều (BULLISH, BEARISH, LIQUIDITY_RISK, SIDEWAYS). Hàm Loss sẽ phạt mượt mà và thông minh hơn rất nhiều.</w:t>
+      </w:r>
+    </w:p>
+    <w:p>
+      <w:pPr>
+        <w:spacing w:after="100" w:line="288" w:lineRule="auto"/>
+        <w:jc w:val="both"/>
+        <w:rPr>
+          <w:rFonts w:ascii="Times New Roman" w:cs="Times New Roman" w:eastAsia="Times New Roman" w:hAnsi="Times New Roman"/>
+          <w:color w:val="222222"/>
+          <w:sz w:val="24"/>
+          <w:szCs w:val="24"/>
+        </w:rPr>
+      </w:pPr>
+      <w:r>
+        <w:rPr>
+          <w:rtl w:val="0"/>
+        </w:rPr>
+      </w:r>
+    </w:p>
+    <w:p>
+      <w:pPr>
+        <w:spacing w:after="100" w:line="288" w:lineRule="auto"/>
+        <w:jc w:val="both"/>
+        <w:rPr>
+          <w:rFonts w:ascii="Times New Roman" w:cs="Times New Roman" w:eastAsia="Times New Roman" w:hAnsi="Times New Roman"/>
+          <w:color w:val="222222"/>
+          <w:sz w:val="24"/>
+          <w:szCs w:val="24"/>
+        </w:rPr>
+      </w:pPr>
+      <w:r>
+        <w:rPr>
+          <w:rFonts w:ascii="Arial Unicode MS" w:cs="Arial Unicode MS" w:eastAsia="Arial Unicode MS" w:hAnsi="Arial Unicode MS"/>
+          <w:color w:val="222222"/>
+          <w:sz w:val="24"/>
+          <w:szCs w:val="24"/>
+          <w:rtl w:val="0"/>
+        </w:rPr>
+        <w:t xml:space="preserve">  #### ③ Xác suất hiệu chuẩn (Calibrated Loss)</w:t>
+      </w:r>
+    </w:p>
+    <w:p>
+      <w:pPr>
+        <w:spacing w:after="100" w:line="288" w:lineRule="auto"/>
+        <w:jc w:val="both"/>
+        <w:rPr>
+          <w:rFonts w:ascii="Times New Roman" w:cs="Times New Roman" w:eastAsia="Times New Roman" w:hAnsi="Times New Roman"/>
+          <w:color w:val="222222"/>
+          <w:sz w:val="24"/>
+          <w:szCs w:val="24"/>
+        </w:rPr>
+      </w:pPr>
+      <w:r>
+        <w:rPr>
+          <w:rtl w:val="0"/>
+        </w:rPr>
+      </w:r>
+    </w:p>
+    <w:p>
+      <w:pPr>
+        <w:spacing w:after="100" w:line="288" w:lineRule="auto"/>
+        <w:jc w:val="both"/>
+        <w:rPr>
+          <w:rFonts w:ascii="Times New Roman" w:cs="Times New Roman" w:eastAsia="Times New Roman" w:hAnsi="Times New Roman"/>
+          <w:color w:val="222222"/>
+          <w:sz w:val="24"/>
+          <w:szCs w:val="24"/>
+        </w:rPr>
+      </w:pPr>
+      <w:r>
+        <w:rPr>
+          <w:rFonts w:ascii="Times New Roman" w:cs="Times New Roman" w:eastAsia="Times New Roman" w:hAnsi="Times New Roman"/>
+          <w:color w:val="222222"/>
+          <w:sz w:val="24"/>
+          <w:szCs w:val="24"/>
+          <w:rtl w:val="0"/>
+        </w:rPr>
+        <w:t xml:space="preserve">  • DeBERTa dùng Softmax thô, rất hay bị "ngáo tự tin" (lúc nào cũng 98-99%), làm gradient lúc train dễ bị bão hòa hoặc phạt sai lệch.</w:t>
+      </w:r>
+    </w:p>
+    <w:p>
+      <w:pPr>
+        <w:spacing w:after="100" w:line="288" w:lineRule="auto"/>
+        <w:jc w:val="both"/>
+        <w:rPr>
+          <w:rFonts w:ascii="Times New Roman" w:cs="Times New Roman" w:eastAsia="Times New Roman" w:hAnsi="Times New Roman"/>
+          <w:color w:val="222222"/>
+          <w:sz w:val="24"/>
+          <w:szCs w:val="24"/>
+        </w:rPr>
+      </w:pPr>
+      <w:r>
+        <w:rPr>
+          <w:rFonts w:ascii="Times New Roman" w:cs="Times New Roman" w:eastAsia="Times New Roman" w:hAnsi="Times New Roman"/>
+          <w:color w:val="222222"/>
+          <w:sz w:val="24"/>
+          <w:szCs w:val="24"/>
+          <w:rtl w:val="0"/>
+        </w:rPr>
+        <w:t xml:space="preserve">  • OpenJev được huấn luyện bằng Brier Score và Temperature Calibration, cho xác suất thực chất P(BULLISH), giúp hàm Loss phản ánh đúng mức độ tin cậy của bài</w:t>
+      </w:r>
+    </w:p>
+    <w:p>
+      <w:pPr>
+        <w:spacing w:after="100" w:line="288" w:lineRule="auto"/>
+        <w:jc w:val="both"/>
+        <w:rPr>
+          <w:rFonts w:ascii="Times New Roman" w:cs="Times New Roman" w:eastAsia="Times New Roman" w:hAnsi="Times New Roman"/>
+          <w:color w:val="222222"/>
+          <w:sz w:val="24"/>
+          <w:szCs w:val="24"/>
+        </w:rPr>
+      </w:pPr>
+      <w:r>
+        <w:rPr>
+          <w:rFonts w:ascii="Times New Roman" w:cs="Times New Roman" w:eastAsia="Times New Roman" w:hAnsi="Times New Roman"/>
+          <w:color w:val="222222"/>
+          <w:sz w:val="24"/>
+          <w:szCs w:val="24"/>
+          <w:rtl w:val="0"/>
+        </w:rPr>
+        <w:t xml:space="preserve">  giải trình.</w:t>
+      </w:r>
+    </w:p>
+    <w:p>
+      <w:pPr>
+        <w:spacing w:after="100" w:line="288" w:lineRule="auto"/>
+        <w:jc w:val="both"/>
+        <w:rPr>
+          <w:rFonts w:ascii="Times New Roman" w:cs="Times New Roman" w:eastAsia="Times New Roman" w:hAnsi="Times New Roman"/>
+          <w:color w:val="222222"/>
+          <w:sz w:val="24"/>
+          <w:szCs w:val="24"/>
+        </w:rPr>
+      </w:pPr>
+      <w:r>
+        <w:rPr>
+          <w:rtl w:val="0"/>
+        </w:rPr>
+      </w:r>
+    </w:p>
+    <w:p>
+      <w:pPr>
+        <w:spacing w:after="100" w:line="288" w:lineRule="auto"/>
+        <w:jc w:val="both"/>
+        <w:rPr>
+          <w:rFonts w:ascii="Times New Roman" w:cs="Times New Roman" w:eastAsia="Times New Roman" w:hAnsi="Times New Roman"/>
+          <w:color w:val="222222"/>
+          <w:sz w:val="24"/>
+          <w:szCs w:val="24"/>
+        </w:rPr>
+      </w:pPr>
+      <w:r>
+        <w:rPr>
+          <w:rFonts w:ascii="Times New Roman" w:cs="Times New Roman" w:eastAsia="Times New Roman" w:hAnsi="Times New Roman"/>
+          <w:color w:val="222222"/>
+          <w:sz w:val="24"/>
+          <w:szCs w:val="24"/>
+          <w:rtl w:val="0"/>
+        </w:rPr>
+        <w:t xml:space="preserve">  #### ④ Tận dụng được luôn làm Guardrail lúc chạy thực tế (2 trong 1)</w:t>
+      </w:r>
+    </w:p>
+    <w:p>
+      <w:pPr>
+        <w:spacing w:after="100" w:line="288" w:lineRule="auto"/>
+        <w:jc w:val="both"/>
+        <w:rPr>
+          <w:rFonts w:ascii="Times New Roman" w:cs="Times New Roman" w:eastAsia="Times New Roman" w:hAnsi="Times New Roman"/>
+          <w:color w:val="222222"/>
+          <w:sz w:val="24"/>
+          <w:szCs w:val="24"/>
+        </w:rPr>
+      </w:pPr>
+      <w:r>
+        <w:rPr>
+          <w:rtl w:val="0"/>
+        </w:rPr>
+      </w:r>
+    </w:p>
+    <w:p>
+      <w:pPr>
+        <w:spacing w:after="100" w:line="288" w:lineRule="auto"/>
+        <w:jc w:val="both"/>
+        <w:rPr>
+          <w:rFonts w:ascii="Times New Roman" w:cs="Times New Roman" w:eastAsia="Times New Roman" w:hAnsi="Times New Roman"/>
+          <w:color w:val="222222"/>
+          <w:sz w:val="24"/>
+          <w:szCs w:val="24"/>
+        </w:rPr>
+      </w:pPr>
+      <w:r>
+        <w:rPr>
+          <w:rFonts w:ascii="Times New Roman" w:cs="Times New Roman" w:eastAsia="Times New Roman" w:hAnsi="Times New Roman"/>
+          <w:color w:val="222222"/>
+          <w:sz w:val="24"/>
+          <w:szCs w:val="24"/>
+          <w:rtl w:val="0"/>
+        </w:rPr>
+        <w:t xml:space="preserve">  • Nếu dùng DeBERTa, bạn chỉ dùng nó được lúc train để tính Loss. Khi triển khai Web/API, DeBERTa không đủ năng lực làm bộ lọc an toàn cho nhà đầu tư.</w:t>
+      </w:r>
+    </w:p>
+    <w:p>
+      <w:pPr>
+        <w:spacing w:after="100" w:line="288" w:lineRule="auto"/>
+        <w:jc w:val="both"/>
+        <w:rPr>
+          <w:rFonts w:ascii="Times New Roman" w:cs="Times New Roman" w:eastAsia="Times New Roman" w:hAnsi="Times New Roman"/>
+          <w:color w:val="222222"/>
+          <w:sz w:val="24"/>
+          <w:szCs w:val="24"/>
+        </w:rPr>
+      </w:pPr>
+      <w:r>
+        <w:rPr>
+          <w:rFonts w:ascii="Times New Roman" w:cs="Times New Roman" w:eastAsia="Times New Roman" w:hAnsi="Times New Roman"/>
+          <w:color w:val="222222"/>
+          <w:sz w:val="24"/>
+          <w:szCs w:val="24"/>
+          <w:rtl w:val="0"/>
+        </w:rPr>
+        <w:t xml:space="preserve">  • Dùng OpenJev, bạn dùng nó 2 trong 1:</w:t>
+      </w:r>
+    </w:p>
+    <w:p>
+      <w:pPr>
+        <w:spacing w:after="100" w:line="288" w:lineRule="auto"/>
+        <w:jc w:val="both"/>
+        <w:rPr>
+          <w:rFonts w:ascii="Times New Roman" w:cs="Times New Roman" w:eastAsia="Times New Roman" w:hAnsi="Times New Roman"/>
+          <w:color w:val="222222"/>
+          <w:sz w:val="24"/>
+          <w:szCs w:val="24"/>
+        </w:rPr>
+      </w:pPr>
+      <w:r>
+        <w:rPr>
+          <w:rFonts w:ascii="Times New Roman" w:cs="Times New Roman" w:eastAsia="Times New Roman" w:hAnsi="Times New Roman"/>
+          <w:color w:val="222222"/>
+          <w:sz w:val="24"/>
+          <w:szCs w:val="24"/>
+          <w:rtl w:val="0"/>
+        </w:rPr>
+        <w:t xml:space="preserve">      • Lúc Train: Đóng vai trò tính Calibrated Consistency Loss.</w:t>
+      </w:r>
+    </w:p>
+    <w:p>
+      <w:pPr>
+        <w:spacing w:after="100" w:line="288" w:lineRule="auto"/>
+        <w:jc w:val="both"/>
+        <w:rPr>
+          <w:rFonts w:ascii="Times New Roman" w:cs="Times New Roman" w:eastAsia="Times New Roman" w:hAnsi="Times New Roman"/>
+          <w:color w:val="222222"/>
+          <w:sz w:val="24"/>
+          <w:szCs w:val="24"/>
+        </w:rPr>
+      </w:pPr>
+      <w:r>
+        <w:rPr>
+          <w:rFonts w:ascii="Times New Roman" w:cs="Times New Roman" w:eastAsia="Times New Roman" w:hAnsi="Times New Roman"/>
+          <w:color w:val="222222"/>
+          <w:sz w:val="24"/>
+          <w:szCs w:val="24"/>
+          <w:rtl w:val="0"/>
+        </w:rPr>
+        <w:t xml:space="preserve">      • Lúc Deploy (FastAPI / Streamlit): Đóng vai trò là Financial Guardrail kiểm định rủi ro trong 15ms.</w:t>
       </w:r>
     </w:p>
     <w:p>
@@ -3239,7 +4299,7 @@
         <w:keepNext w:val="1"/>
         <w:numPr>
           <w:ilvl w:val="0"/>
-          <w:numId w:val="4"/>
+          <w:numId w:val="5"/>
         </w:numPr>
         <w:shd w:fill="ffffff" w:val="clear"/>
         <w:spacing w:after="0" w:afterAutospacing="0" w:before="240" w:line="276" w:lineRule="auto"/>
@@ -3288,7 +4348,7 @@
         <w:keepNext w:val="1"/>
         <w:numPr>
           <w:ilvl w:val="0"/>
-          <w:numId w:val="4"/>
+          <w:numId w:val="5"/>
         </w:numPr>
         <w:shd w:fill="ffffff" w:val="clear"/>
         <w:spacing w:after="240" w:before="0" w:beforeAutospacing="0" w:line="276" w:lineRule="auto"/>
@@ -5772,7 +6832,7 @@
                 <w:color w:val="ffffff"/>
                 <w:rtl w:val="0"/>
               </w:rPr>
-              <w:t xml:space="preserve">Mục tiêu đề tài (SLM 0.5B)</w:t>
+              <w:t xml:space="preserve">Mục tiêu đề tài (SLM 1.5B)</w:t>
             </w:r>
             <w:r>
               <w:rPr>
@@ -5881,7 +6941,7 @@
                 <w:szCs w:val="21"/>
                 <w:rtl w:val="0"/>
               </w:rPr>
-              <w:t xml:space="preserve">&lt; 200 ms</w:t>
+              <w:t xml:space="preserve">&lt; 500 ms</w:t>
             </w:r>
             <w:r>
               <w:rPr>
@@ -6595,7 +7655,7 @@
                 <w:szCs w:val="21"/>
                 <w:rtl w:val="0"/>
               </w:rPr>
-              <w:t xml:space="preserve">Huấn luyện Qwen2.5-0.5B qua QLoRA 4-bit với Multi-Task Output Heads</w:t>
+              <w:t xml:space="preserve">Huấn luyện Qwen2.5-1.5B qua QLoRA 4-bit với Multi-Task Output Heads</w:t>
             </w:r>
             <w:r>
               <w:rPr>
@@ -7768,7 +8828,7 @@
           <w:szCs w:val="24"/>
           <w:rtl w:val="0"/>
         </w:rPr>
-        <w:t xml:space="preserve">1. Bộ mô hình SLM 0.5B: </w:t>
+        <w:t xml:space="preserve">1. Bộ mô hình SLM 1.5B: </w:t>
       </w:r>
       <w:r>
         <w:rPr>
@@ -7989,8 +9049,8 @@
           <w:szCs w:val="30"/>
         </w:rPr>
       </w:pPr>
-      <w:bookmarkStart w:colFirst="0" w:colLast="0" w:name="_jna8a5xaww11" w:id="0"/>
-      <w:bookmarkEnd w:id="0"/>
+      <w:bookmarkStart w:colFirst="0" w:colLast="0" w:name="_jna8a5xaww11" w:id="6"/>
+      <w:bookmarkEnd w:id="6"/>
       <w:r>
         <w:rPr>
           <w:rFonts w:ascii="Roboto" w:cs="Roboto" w:eastAsia="Roboto" w:hAnsi="Roboto"/>
@@ -8086,8 +9146,8 @@
           <w:szCs w:val="30"/>
         </w:rPr>
       </w:pPr>
-      <w:bookmarkStart w:colFirst="0" w:colLast="0" w:name="_57h1xty0wa6x" w:id="1"/>
-      <w:bookmarkEnd w:id="1"/>
+      <w:bookmarkStart w:colFirst="0" w:colLast="0" w:name="_57h1xty0wa6x" w:id="7"/>
+      <w:bookmarkEnd w:id="7"/>
       <w:r>
         <w:rPr>
           <w:rFonts w:ascii="Roboto" w:cs="Roboto" w:eastAsia="Roboto" w:hAnsi="Roboto"/>
@@ -8139,56 +9199,12 @@
     </w:p>
     <w:p>
       <w:pPr>
-        <w:widowControl w:val="0"/>
-        <w:spacing w:line="300" w:lineRule="auto"/>
-        <w:ind w:left="600" w:firstLine="0"/>
         <w:rPr/>
       </w:pPr>
       <w:r>
         <w:rPr>
           <w:rtl w:val="0"/>
         </w:rPr>
-      </w:r>
-    </w:p>
-    <w:p>
-      <w:pPr>
-        <w:rPr/>
-      </w:pPr>
-      <w:hyperlink r:id="rId7">
-        <w:r>
-          <w:rPr>
-            <w:color w:val="1155cc"/>
-            <w:u w:val="single"/>
-            <w:rtl w:val="0"/>
-          </w:rPr>
-          <w:t xml:space="preserve">https://www.youtube.com/watch?v=wjZofJX0v4M</w:t>
-        </w:r>
-      </w:hyperlink>
-      <w:r>
-        <w:rPr>
-          <w:rtl w:val="0"/>
-        </w:rPr>
-      </w:r>
-    </w:p>
-    <w:p>
-      <w:pPr>
-        <w:rPr/>
-      </w:pPr>
-      <w:hyperlink r:id="rId8">
-        <w:r>
-          <w:rPr>
-            <w:color w:val="1155cc"/>
-            <w:u w:val="single"/>
-            <w:rtl w:val="0"/>
-          </w:rPr>
-          <w:t xml:space="preserve">https://www.youtube.com/watch?v=eMlx5fFNoYc&amp;t=11s</w:t>
-        </w:r>
-      </w:hyperlink>
-      <w:r>
-        <w:rPr>
-          <w:rtl w:val="0"/>
-        </w:rPr>
-        <w:tab/>
       </w:r>
     </w:p>
     <w:p>
@@ -8252,8 +9268,8 @@
           <w:szCs w:val="30"/>
         </w:rPr>
       </w:pPr>
-      <w:bookmarkStart w:colFirst="0" w:colLast="0" w:name="_xdluvbtq4qs2" w:id="2"/>
-      <w:bookmarkEnd w:id="2"/>
+      <w:bookmarkStart w:colFirst="0" w:colLast="0" w:name="_xdluvbtq4qs2" w:id="8"/>
+      <w:bookmarkEnd w:id="8"/>
       <w:r>
         <w:rPr>
           <w:rFonts w:ascii="Andika" w:cs="Andika" w:eastAsia="Andika" w:hAnsi="Andika"/>
@@ -8351,8 +9367,8 @@
           <w:szCs w:val="30"/>
         </w:rPr>
       </w:pPr>
-      <w:bookmarkStart w:colFirst="0" w:colLast="0" w:name="_v90z98di7kkz" w:id="3"/>
-      <w:bookmarkEnd w:id="3"/>
+      <w:bookmarkStart w:colFirst="0" w:colLast="0" w:name="_v90z98di7kkz" w:id="9"/>
+      <w:bookmarkEnd w:id="9"/>
       <w:r>
         <w:rPr>
           <w:rFonts w:ascii="Roboto" w:cs="Roboto" w:eastAsia="Roboto" w:hAnsi="Roboto"/>
@@ -8450,8 +9466,8 @@
           <w:szCs w:val="30"/>
         </w:rPr>
       </w:pPr>
-      <w:bookmarkStart w:colFirst="0" w:colLast="0" w:name="_ixsfjmwm92w9" w:id="4"/>
-      <w:bookmarkEnd w:id="4"/>
+      <w:bookmarkStart w:colFirst="0" w:colLast="0" w:name="_ixsfjmwm92w9" w:id="10"/>
+      <w:bookmarkEnd w:id="10"/>
       <w:r>
         <w:rPr>
           <w:rFonts w:ascii="Roboto" w:cs="Roboto" w:eastAsia="Roboto" w:hAnsi="Roboto"/>
@@ -8593,8 +9609,8 @@
           <w:szCs w:val="30"/>
         </w:rPr>
       </w:pPr>
-      <w:bookmarkStart w:colFirst="0" w:colLast="0" w:name="_yetxihvrduo6" w:id="5"/>
-      <w:bookmarkEnd w:id="5"/>
+      <w:bookmarkStart w:colFirst="0" w:colLast="0" w:name="_yetxihvrduo6" w:id="11"/>
+      <w:bookmarkEnd w:id="11"/>
       <w:r>
         <w:rPr>
           <w:rFonts w:ascii="Andika" w:cs="Andika" w:eastAsia="Andika" w:hAnsi="Andika"/>
@@ -9296,8 +10312,8 @@
           <w:szCs w:val="30"/>
         </w:rPr>
       </w:pPr>
-      <w:bookmarkStart w:colFirst="0" w:colLast="0" w:name="_jzf77gfgl0o4" w:id="6"/>
-      <w:bookmarkEnd w:id="6"/>
+      <w:bookmarkStart w:colFirst="0" w:colLast="0" w:name="_jzf77gfgl0o4" w:id="12"/>
+      <w:bookmarkEnd w:id="12"/>
       <w:r>
         <w:rPr>
           <w:rFonts w:ascii="Andika" w:cs="Andika" w:eastAsia="Andika" w:hAnsi="Andika"/>
@@ -9946,8 +10962,8 @@
           <w:szCs w:val="30"/>
         </w:rPr>
       </w:pPr>
-      <w:bookmarkStart w:colFirst="0" w:colLast="0" w:name="_23bnrlkfokfo" w:id="7"/>
-      <w:bookmarkEnd w:id="7"/>
+      <w:bookmarkStart w:colFirst="0" w:colLast="0" w:name="_23bnrlkfokfo" w:id="13"/>
+      <w:bookmarkEnd w:id="13"/>
       <w:r>
         <w:rPr>
           <w:rFonts w:ascii="Andika" w:cs="Andika" w:eastAsia="Andika" w:hAnsi="Andika"/>
@@ -9999,8 +11015,8 @@
           <w:szCs w:val="30"/>
         </w:rPr>
       </w:pPr>
-      <w:bookmarkStart w:colFirst="0" w:colLast="0" w:name="_3uoy2vor332k" w:id="8"/>
-      <w:bookmarkEnd w:id="8"/>
+      <w:bookmarkStart w:colFirst="0" w:colLast="0" w:name="_3uoy2vor332k" w:id="14"/>
+      <w:bookmarkEnd w:id="14"/>
       <w:r>
         <w:rPr>
           <w:rFonts w:ascii="Andika" w:cs="Andika" w:eastAsia="Andika" w:hAnsi="Andika"/>
@@ -10052,8 +11068,8 @@
           <w:szCs w:val="30"/>
         </w:rPr>
       </w:pPr>
-      <w:bookmarkStart w:colFirst="0" w:colLast="0" w:name="_zg2bq4e0j2k2" w:id="9"/>
-      <w:bookmarkEnd w:id="9"/>
+      <w:bookmarkStart w:colFirst="0" w:colLast="0" w:name="_zg2bq4e0j2k2" w:id="15"/>
+      <w:bookmarkEnd w:id="15"/>
       <w:r>
         <w:rPr>
           <w:rFonts w:ascii="Andika" w:cs="Andika" w:eastAsia="Andika" w:hAnsi="Andika"/>
@@ -10116,8 +11132,8 @@
           <w:szCs w:val="33"/>
         </w:rPr>
       </w:pPr>
-      <w:bookmarkStart w:colFirst="0" w:colLast="0" w:name="_dh3j9p7kbxx0" w:id="10"/>
-      <w:bookmarkEnd w:id="10"/>
+      <w:bookmarkStart w:colFirst="0" w:colLast="0" w:name="_dh3j9p7kbxx0" w:id="16"/>
+      <w:bookmarkEnd w:id="16"/>
       <w:r>
         <w:rPr>
           <w:rFonts w:ascii="Roboto" w:cs="Roboto" w:eastAsia="Roboto" w:hAnsi="Roboto"/>
@@ -15125,8 +16141,8 @@
           <w:szCs w:val="33"/>
         </w:rPr>
       </w:pPr>
-      <w:bookmarkStart w:colFirst="0" w:colLast="0" w:name="_j41q9f6xb2wz" w:id="11"/>
-      <w:bookmarkEnd w:id="11"/>
+      <w:bookmarkStart w:colFirst="0" w:colLast="0" w:name="_j41q9f6xb2wz" w:id="17"/>
+      <w:bookmarkEnd w:id="17"/>
       <w:r>
         <w:rPr>
           <w:rFonts w:ascii="Roboto" w:cs="Roboto" w:eastAsia="Roboto" w:hAnsi="Roboto"/>
@@ -15182,8 +16198,8 @@
           <w:szCs w:val="30"/>
         </w:rPr>
       </w:pPr>
-      <w:bookmarkStart w:colFirst="0" w:colLast="0" w:name="_ezonimbco644" w:id="12"/>
-      <w:bookmarkEnd w:id="12"/>
+      <w:bookmarkStart w:colFirst="0" w:colLast="0" w:name="_ezonimbco644" w:id="18"/>
+      <w:bookmarkEnd w:id="18"/>
       <w:r>
         <w:rPr>
           <w:rFonts w:ascii="Roboto" w:cs="Roboto" w:eastAsia="Roboto" w:hAnsi="Roboto"/>
@@ -18075,8 +19091,8 @@
           <w:szCs w:val="33"/>
         </w:rPr>
       </w:pPr>
-      <w:bookmarkStart w:colFirst="0" w:colLast="0" w:name="_cq3xwx2hl0wa" w:id="13"/>
-      <w:bookmarkEnd w:id="13"/>
+      <w:bookmarkStart w:colFirst="0" w:colLast="0" w:name="_cq3xwx2hl0wa" w:id="19"/>
+      <w:bookmarkEnd w:id="19"/>
       <w:r>
         <w:rPr>
           <w:rFonts w:ascii="Roboto" w:cs="Roboto" w:eastAsia="Roboto" w:hAnsi="Roboto"/>
@@ -18132,8 +19148,8 @@
           <w:szCs w:val="30"/>
         </w:rPr>
       </w:pPr>
-      <w:bookmarkStart w:colFirst="0" w:colLast="0" w:name="_pht7091mu8ld" w:id="14"/>
-      <w:bookmarkEnd w:id="14"/>
+      <w:bookmarkStart w:colFirst="0" w:colLast="0" w:name="_pht7091mu8ld" w:id="20"/>
+      <w:bookmarkEnd w:id="20"/>
       <w:r>
         <w:rPr>
           <w:rFonts w:ascii="Roboto" w:cs="Roboto" w:eastAsia="Roboto" w:hAnsi="Roboto"/>
@@ -20594,8 +21610,8 @@
           <w:szCs w:val="33"/>
         </w:rPr>
       </w:pPr>
-      <w:bookmarkStart w:colFirst="0" w:colLast="0" w:name="_mzjnmnyu6p65" w:id="15"/>
-      <w:bookmarkEnd w:id="15"/>
+      <w:bookmarkStart w:colFirst="0" w:colLast="0" w:name="_mzjnmnyu6p65" w:id="21"/>
+      <w:bookmarkEnd w:id="21"/>
       <w:r>
         <w:rPr>
           <w:rFonts w:ascii="Roboto" w:cs="Roboto" w:eastAsia="Roboto" w:hAnsi="Roboto"/>
@@ -20704,7 +21720,7 @@
         <w:keepNext w:val="1"/>
         <w:numPr>
           <w:ilvl w:val="0"/>
-          <w:numId w:val="3"/>
+          <w:numId w:val="4"/>
         </w:numPr>
         <w:shd w:fill="ffffff" w:val="clear"/>
         <w:spacing w:after="0" w:afterAutospacing="0" w:before="240" w:line="276" w:lineRule="auto"/>
@@ -20726,7 +21742,7 @@
         <w:keepNext w:val="1"/>
         <w:numPr>
           <w:ilvl w:val="0"/>
-          <w:numId w:val="3"/>
+          <w:numId w:val="4"/>
         </w:numPr>
         <w:shd w:fill="ffffff" w:val="clear"/>
         <w:spacing w:after="0" w:afterAutospacing="0" w:before="0" w:beforeAutospacing="0" w:line="276" w:lineRule="auto"/>
@@ -20748,7 +21764,7 @@
         <w:keepNext w:val="1"/>
         <w:numPr>
           <w:ilvl w:val="0"/>
-          <w:numId w:val="3"/>
+          <w:numId w:val="4"/>
         </w:numPr>
         <w:shd w:fill="ffffff" w:val="clear"/>
         <w:spacing w:after="240" w:before="0" w:beforeAutospacing="0" w:line="276" w:lineRule="auto"/>
@@ -21070,6 +22086,116 @@
         <w:ind w:left="720" w:hanging="360"/>
       </w:pPr>
       <w:rPr>
+        <w:u w:val="none"/>
+      </w:rPr>
+    </w:lvl>
+    <w:lvl w:ilvl="1">
+      <w:start w:val="1"/>
+      <w:numFmt w:val="bullet"/>
+      <w:lvlText w:val="○"/>
+      <w:lvlJc w:val="left"/>
+      <w:pPr>
+        <w:ind w:left="1440" w:hanging="360"/>
+      </w:pPr>
+      <w:rPr>
+        <w:u w:val="none"/>
+      </w:rPr>
+    </w:lvl>
+    <w:lvl w:ilvl="2">
+      <w:start w:val="1"/>
+      <w:numFmt w:val="bullet"/>
+      <w:lvlText w:val="■"/>
+      <w:lvlJc w:val="left"/>
+      <w:pPr>
+        <w:ind w:left="2160" w:hanging="360"/>
+      </w:pPr>
+      <w:rPr>
+        <w:u w:val="none"/>
+      </w:rPr>
+    </w:lvl>
+    <w:lvl w:ilvl="3">
+      <w:start w:val="1"/>
+      <w:numFmt w:val="bullet"/>
+      <w:lvlText w:val="●"/>
+      <w:lvlJc w:val="left"/>
+      <w:pPr>
+        <w:ind w:left="2880" w:hanging="360"/>
+      </w:pPr>
+      <w:rPr>
+        <w:u w:val="none"/>
+      </w:rPr>
+    </w:lvl>
+    <w:lvl w:ilvl="4">
+      <w:start w:val="1"/>
+      <w:numFmt w:val="bullet"/>
+      <w:lvlText w:val="○"/>
+      <w:lvlJc w:val="left"/>
+      <w:pPr>
+        <w:ind w:left="3600" w:hanging="360"/>
+      </w:pPr>
+      <w:rPr>
+        <w:u w:val="none"/>
+      </w:rPr>
+    </w:lvl>
+    <w:lvl w:ilvl="5">
+      <w:start w:val="1"/>
+      <w:numFmt w:val="bullet"/>
+      <w:lvlText w:val="■"/>
+      <w:lvlJc w:val="left"/>
+      <w:pPr>
+        <w:ind w:left="4320" w:hanging="360"/>
+      </w:pPr>
+      <w:rPr>
+        <w:u w:val="none"/>
+      </w:rPr>
+    </w:lvl>
+    <w:lvl w:ilvl="6">
+      <w:start w:val="1"/>
+      <w:numFmt w:val="bullet"/>
+      <w:lvlText w:val="●"/>
+      <w:lvlJc w:val="left"/>
+      <w:pPr>
+        <w:ind w:left="5040" w:hanging="360"/>
+      </w:pPr>
+      <w:rPr>
+        <w:u w:val="none"/>
+      </w:rPr>
+    </w:lvl>
+    <w:lvl w:ilvl="7">
+      <w:start w:val="1"/>
+      <w:numFmt w:val="bullet"/>
+      <w:lvlText w:val="○"/>
+      <w:lvlJc w:val="left"/>
+      <w:pPr>
+        <w:ind w:left="5760" w:hanging="360"/>
+      </w:pPr>
+      <w:rPr>
+        <w:u w:val="none"/>
+      </w:rPr>
+    </w:lvl>
+    <w:lvl w:ilvl="8">
+      <w:start w:val="1"/>
+      <w:numFmt w:val="bullet"/>
+      <w:lvlText w:val="■"/>
+      <w:lvlJc w:val="left"/>
+      <w:pPr>
+        <w:ind w:left="6480" w:hanging="360"/>
+      </w:pPr>
+      <w:rPr>
+        <w:u w:val="none"/>
+      </w:rPr>
+    </w:lvl>
+  </w:abstractNum>
+  <w:abstractNum w:abstractNumId="4">
+    <w:lvl w:ilvl="0">
+      <w:start w:val="1"/>
+      <w:numFmt w:val="bullet"/>
+      <w:lvlText w:val="●"/>
+      <w:lvlJc w:val="left"/>
+      <w:pPr>
+        <w:ind w:left="720" w:hanging="360"/>
+      </w:pPr>
+      <w:rPr>
         <w:rFonts w:ascii="Roboto" w:cs="Roboto" w:eastAsia="Roboto" w:hAnsi="Roboto"/>
         <w:b w:val="0"/>
         <w:bCs w:val="0"/>
@@ -21179,7 +22305,7 @@
       </w:rPr>
     </w:lvl>
   </w:abstractNum>
-  <w:abstractNum w:abstractNumId="4">
+  <w:abstractNum w:abstractNumId="5">
     <w:lvl w:ilvl="0">
       <w:start w:val="1"/>
       <w:numFmt w:val="bullet"/>
@@ -21300,6 +22426,9 @@
   </w:num>
   <w:num w:numId="4">
     <w:abstractNumId w:val="4"/>
+  </w:num>
+  <w:num w:numId="5">
+    <w:abstractNumId w:val="5"/>
   </w:num>
 </w:numbering>
 </file>

</xml_diff>